<commit_message>
Agreements: act on the combined pre-merge reviews
MSA Background IP license becomes irrevocable on payment in full, matching
the work-for-hire twin. Contractor AI clause takes the shared vendor test and
counts as a permitted disclosure under its confidentiality section. Toolkit
definition names the remaining components and is open-ended. Build loop
renders each DOCX and PDF pair into scratch and moves both together, so a
failed export cannot leave a new DOCX beside a stale PDF on the site.
Accessibility statement review dates bumped. One agreements bullet scoped
to what the clause says.
</commit_message>
<xml_diff>
--- a/public/agreements/MSA_LuwahTech_Template_v1.docx
+++ b/public/agreements/MSA_LuwahTech_Template_v1.docx
@@ -2063,7 +2063,7 @@
           <w:color w:val="262626"/>
           <w:sz w:val="21"/>
         </w:rPr>
-        <w:t>Provider keeps all rights in Background IP. Where Background IP is incorporated into a Deliverable, Provider grants Client a perpetual, worldwide, non-exclusive, royalty-free license to use, copy, modify and distribute that Background IP as part of the Deliverable for Client's business purposes, except as Section 7.7 provides. Client may not sell or license the Background IP on its own or separate it from the Deliverable for that purpose.</w:t>
+        <w:t>Provider keeps all rights in Background IP. Where Background IP is incorporated into a Deliverable, Provider grants Client a perpetual, worldwide, non-exclusive, royalty-free license to use, copy, modify and distribute that Background IP as part of the Deliverable for Client's business purposes, except as Section 7.7 provides. The license becomes irrevocable when Client has paid in full for the Deliverable that contains the Background IP. Until then Provider may suspend it while Client is in default of payment under this Agreement. Client may not sell or license the Background IP on its own or separate it from the Deliverable for that purpose.</w:t>
       </w:r>
     </w:p>
     <w:p>
@@ -2219,7 +2219,7 @@
           <w:color w:val="262626"/>
           <w:sz w:val="21"/>
         </w:rPr>
-        <w:t>The Luwah Accessibility Toolkit, meaning the Accessibility Center launcher and drawer, the disability profiles and individual adjustments, the page-structure navigator, the reading overlays, the image description layer, the issue report form, the accessibility statement content, the keyboard shortcut handling and the CSS hooks, together with the code, styles and documentation that support them, is Background IP that Provider designed, built and owns. Where the Toolkit is delivered with a website, Client receives the license in Section 7.3 as part of the Deliverable, on the websites and systems the SOW names only. Client may configure and modify the Toolkit on that website. Client may not copy the Toolkit to another website, application, product or system, remove it for separate use, sublicense, sell, rent, lease or distribute it on its own, remove or alter Provider's notices in it, present it as Client's own product or as a third-party vendor's product, or let a third party do any of those things. Use on any other property needs a separate written license from Provider. The accessibility statement published with the Toolkit describes a self-assessment against WCAG 2.2 AA, not a certification, and Client keeps that statement accurate to the website it describes after delivery.</w:t>
+        <w:t>The Luwah Accessibility Toolkit, meaning the Accessibility Center launcher and drawer, the disability profiles and individual adjustments, the page-structure navigator, the reading overlays, the image description layer, the text magnifier, the read mode, the embed focus ring, the sound muting and hidden image text layers, the issue report form, the accessibility statement content, the keyboard shortcut handling and the CSS hooks, together with every other component, style, hook and document shipped as part of it, is Background IP that Provider designed, built and owns. Where the Toolkit is delivered with a website, Client receives the license in Section 7.3 as part of the Deliverable, on the websites and systems the SOW names only. Client may configure and modify the Toolkit on that website. Client may not copy the Toolkit to another website, application, product or system, remove it for separate use, sublicense, sell, rent, lease or distribute it on its own, remove or alter Provider's notices in it, present it as Client's own product or as a third-party vendor's product, or let a third party do any of those things. Use on any other property needs a separate written license from Provider. The accessibility statement published with the Toolkit describes a self-assessment against WCAG 2.2 AA, not a certification, and Client keeps that statement accurate to the website it describes after delivery.</w:t>
       </w:r>
     </w:p>
     <w:p>

</xml_diff>